<commit_message>
Rett "åtte portaler" til "sju" — matcher faktisk integrerte etater
Hero, ingress og dokumentasjon sa 8 portaler, men den åttende
("kommunens planinnsyn") er ikke en separat integrasjon — DiBK
aggregerer kommunale regulerings- og kommuneplaner nasjonalt.
Faktisk antall norske offentlige portaler som kalles: 7
(Kartverket, NVE, NGU, SSB, Statens vegvesen, DiBK, Riksantikvaren).

Co-Authored-By: Claude Opus 4.7 (1M context) <noreply@anthropic.com>
</commit_message>
<xml_diff>
--- a/docs/videomanus.docx
+++ b/docs/videomanus.docx
@@ -217,7 +217,21 @@
         <w:rPr>
           <w:lang w:val="nb-NO"/>
         </w:rPr>
-        <w:t>“Vi starter med å søke opp en adresse. Jeg skriver inn [ADRESSE] og klikker Analyser.”</w:t>
+        <w:t xml:space="preserve">“Vi starter med å søke opp en adresse. Jeg skriver inn [ADRESSE] og </w:t>
+      </w:r>
+      <w:proofErr w:type="gramStart"/>
+      <w:r>
+        <w:rPr>
+          <w:lang w:val="nb-NO"/>
+        </w:rPr>
+        <w:t>klikker</w:t>
+      </w:r>
+      <w:proofErr w:type="gramEnd"/>
+      <w:r>
+        <w:rPr>
+          <w:lang w:val="nb-NO"/>
+        </w:rPr>
+        <w:t xml:space="preserve"> Analyser.”</w:t>
       </w:r>
     </w:p>
     <w:p>
@@ -348,81 +362,81 @@
           <w:lang w:val="nb-NO"/>
         </w:rPr>
         <w:lastRenderedPageBreak/>
-        <w:t>[Klikk Full rapport]</w:t>
-      </w:r>
-    </w:p>
-    <w:p>
-      <w:pPr>
-        <w:pStyle w:val="Blokktekst"/>
-        <w:rPr>
-          <w:lang w:val="nb-NO"/>
-        </w:rPr>
-      </w:pPr>
-      <w:r>
-        <w:rPr>
-          <w:lang w:val="nb-NO"/>
-        </w:rPr>
-        <w:t xml:space="preserve">“Detaljer-siden viser alt: klimaprojeksjon mot </w:t>
-      </w:r>
-      <w:r>
-        <w:rPr>
-          <w:lang w:val="nb-NO"/>
-        </w:rPr>
-        <w:t xml:space="preserve">år </w:t>
-      </w:r>
-      <w:r>
-        <w:rPr>
-          <w:lang w:val="nb-NO"/>
-        </w:rPr>
-        <w:t xml:space="preserve">2100 med havstigning og nedbørendring, AI-analyse av kartbildet, </w:t>
-      </w:r>
-      <w:proofErr w:type="spellStart"/>
-      <w:r>
-        <w:rPr>
-          <w:lang w:val="nb-NO"/>
-        </w:rPr>
-        <w:t>byggemuligheter</w:t>
-      </w:r>
-      <w:proofErr w:type="spellEnd"/>
-      <w:r>
-        <w:rPr>
-          <w:lang w:val="nb-NO"/>
-        </w:rPr>
-        <w:t xml:space="preserve"> basert på reguleringsplanen, og alle 14 analysekortene med kart per kategori.”</w:t>
-      </w:r>
-    </w:p>
-    <w:p>
-      <w:pPr>
-        <w:pStyle w:val="FirstParagraph"/>
-        <w:rPr>
-          <w:lang w:val="nb-NO"/>
-        </w:rPr>
-      </w:pPr>
+        <w:t>[</w:t>
+      </w:r>
+      <w:proofErr w:type="gramStart"/>
       <w:r>
         <w:rPr>
           <w:i/>
           <w:iCs/>
           <w:lang w:val="nb-NO"/>
         </w:rPr>
-        <w:t>[</w:t>
-      </w:r>
-      <w:proofErr w:type="spellStart"/>
+        <w:t>Klikk</w:t>
+      </w:r>
+      <w:proofErr w:type="gramEnd"/>
       <w:r>
         <w:rPr>
           <w:i/>
           <w:iCs/>
           <w:lang w:val="nb-NO"/>
         </w:rPr>
-        <w:t>Scroll</w:t>
-      </w:r>
-      <w:proofErr w:type="spellEnd"/>
+        <w:t xml:space="preserve"> Full rapport]</w:t>
+      </w:r>
+    </w:p>
+    <w:p>
+      <w:pPr>
+        <w:pStyle w:val="Blokktekst"/>
+        <w:rPr>
+          <w:lang w:val="nb-NO"/>
+        </w:rPr>
+      </w:pPr>
+      <w:r>
+        <w:rPr>
+          <w:lang w:val="nb-NO"/>
+        </w:rPr>
+        <w:t xml:space="preserve">“Detaljer-siden viser alt: klimaprojeksjon mot </w:t>
+      </w:r>
+      <w:r>
+        <w:rPr>
+          <w:lang w:val="nb-NO"/>
+        </w:rPr>
+        <w:t xml:space="preserve">år </w:t>
+      </w:r>
+      <w:r>
+        <w:rPr>
+          <w:lang w:val="nb-NO"/>
+        </w:rPr>
+        <w:t xml:space="preserve">2100 med havstigning og nedbørendring, AI-analyse av kartbildet, </w:t>
+      </w:r>
+      <w:proofErr w:type="spellStart"/>
+      <w:r>
+        <w:rPr>
+          <w:lang w:val="nb-NO"/>
+        </w:rPr>
+        <w:t>byggemuligheter</w:t>
+      </w:r>
+      <w:proofErr w:type="spellEnd"/>
+      <w:r>
+        <w:rPr>
+          <w:lang w:val="nb-NO"/>
+        </w:rPr>
+        <w:t xml:space="preserve"> basert på reguleringsplanen, og alle 14 analysekortene med kart per kategori.”</w:t>
+      </w:r>
+    </w:p>
+    <w:p>
+      <w:pPr>
+        <w:pStyle w:val="FirstParagraph"/>
+        <w:rPr>
+          <w:lang w:val="nb-NO"/>
+        </w:rPr>
+      </w:pPr>
       <w:r>
         <w:rPr>
           <w:i/>
           <w:iCs/>
           <w:lang w:val="nb-NO"/>
         </w:rPr>
-        <w:t xml:space="preserve"> gjennom noen kort — vis BYA-</w:t>
+        <w:t>[</w:t>
       </w:r>
       <w:proofErr w:type="spellStart"/>
       <w:r>
@@ -431,7 +445,7 @@
           <w:iCs/>
           <w:lang w:val="nb-NO"/>
         </w:rPr>
-        <w:t>griden</w:t>
+        <w:t>Scroll</w:t>
       </w:r>
       <w:proofErr w:type="spellEnd"/>
       <w:r>
@@ -440,6 +454,24 @@
           <w:iCs/>
           <w:lang w:val="nb-NO"/>
         </w:rPr>
+        <w:t xml:space="preserve"> gjennom noen kort — vis BYA-</w:t>
+      </w:r>
+      <w:proofErr w:type="spellStart"/>
+      <w:r>
+        <w:rPr>
+          <w:i/>
+          <w:iCs/>
+          <w:lang w:val="nb-NO"/>
+        </w:rPr>
+        <w:t>griden</w:t>
+      </w:r>
+      <w:proofErr w:type="spellEnd"/>
+      <w:r>
+        <w:rPr>
+          <w:i/>
+          <w:iCs/>
+          <w:lang w:val="nb-NO"/>
+        </w:rPr>
         <w:t>, VA-kortet, klima-seksjonen]</w:t>
       </w:r>
     </w:p>
@@ -576,7 +608,21 @@
         <w:rPr>
           <w:lang w:val="nb-NO"/>
         </w:rPr>
-        <w:t>“Nå skjer det mye under panseret: verktøyet genererer 144 prøvepunkter over hele kommunen, sjekker regulering på hvert punkt, filtrerer mot bygningstype, kjører NVE risikosjekk, og analyserer de beste kandidatene med 9 ulike API-kall hver.”</w:t>
+        <w:t xml:space="preserve">“Nå skjer det mye under panseret: verktøyet </w:t>
+      </w:r>
+      <w:proofErr w:type="gramStart"/>
+      <w:r>
+        <w:rPr>
+          <w:lang w:val="nb-NO"/>
+        </w:rPr>
+        <w:t>genererer</w:t>
+      </w:r>
+      <w:proofErr w:type="gramEnd"/>
+      <w:r>
+        <w:rPr>
+          <w:lang w:val="nb-NO"/>
+        </w:rPr>
+        <w:t xml:space="preserve"> 144 prøvepunkter over hele kommunen, sjekker regulering på hvert punkt, filtrerer mot bygningstype, kjører NVE risikosjekk, og analyserer de beste kandidatene med 9 ulike API-kall hver.”</w:t>
       </w:r>
     </w:p>
     <w:p>
@@ -846,7 +892,33 @@
         <w:rPr>
           <w:lang w:val="nb-NO"/>
         </w:rPr>
-        <w:t xml:space="preserve"> designsystem. Det integrerer 16 offentlige API-endepunkter.”</w:t>
+        <w:t xml:space="preserve"> designsystem. Det </w:t>
+      </w:r>
+      <w:proofErr w:type="gramStart"/>
+      <w:r>
+        <w:rPr>
+          <w:lang w:val="nb-NO"/>
+        </w:rPr>
+        <w:t>integrerer</w:t>
+      </w:r>
+      <w:proofErr w:type="gramEnd"/>
+      <w:r>
+        <w:rPr>
+          <w:lang w:val="nb-NO"/>
+        </w:rPr>
+        <w:t xml:space="preserve"> 1</w:t>
+      </w:r>
+      <w:r>
+        <w:rPr>
+          <w:lang w:val="nb-NO"/>
+        </w:rPr>
+        <w:t>4</w:t>
+      </w:r>
+      <w:r>
+        <w:rPr>
+          <w:lang w:val="nb-NO"/>
+        </w:rPr>
+        <w:t xml:space="preserve"> offentlige API-endepunkter.”</w:t>
       </w:r>
     </w:p>
     <w:p>
@@ -1325,7 +1397,33 @@
         <w:rPr>
           <w:lang w:val="nb-NO"/>
         </w:rPr>
-        <w:t>. Det integrerer 16 datakilder, bruker 3 distinkte AI-mønstre, og gir en rapport med juridisk forankring i TEK17.”</w:t>
+        <w:t xml:space="preserve">. Det </w:t>
+      </w:r>
+      <w:proofErr w:type="gramStart"/>
+      <w:r>
+        <w:rPr>
+          <w:lang w:val="nb-NO"/>
+        </w:rPr>
+        <w:t>integrerer</w:t>
+      </w:r>
+      <w:proofErr w:type="gramEnd"/>
+      <w:r>
+        <w:rPr>
+          <w:lang w:val="nb-NO"/>
+        </w:rPr>
+        <w:t xml:space="preserve"> 1</w:t>
+      </w:r>
+      <w:r>
+        <w:rPr>
+          <w:lang w:val="nb-NO"/>
+        </w:rPr>
+        <w:t>4</w:t>
+      </w:r>
+      <w:r>
+        <w:rPr>
+          <w:lang w:val="nb-NO"/>
+        </w:rPr>
+        <w:t xml:space="preserve"> datakilder, bruker 3 distinkte AI-mønstre, og gir en rapport med juridisk forankring i TEK17.”</w:t>
       </w:r>
     </w:p>
     <w:p>
@@ -1455,7 +1553,21 @@
         <w:rPr>
           <w:lang w:val="nb-NO"/>
         </w:rPr>
-        <w:t>. SDG 11.5 — vi flagger flom- og skredrisiko før kjøp, direkte relevant etter Gjerdrum. SDG 13.1 — vi integrerer klimaprojeksjoner til 2100 i tomtevurderingen.”</w:t>
+        <w:t xml:space="preserve">. SDG 11.5 — vi flagger flom- og skredrisiko før kjøp, direkte relevant etter Gjerdrum. SDG 13.1 — vi </w:t>
+      </w:r>
+      <w:proofErr w:type="gramStart"/>
+      <w:r>
+        <w:rPr>
+          <w:lang w:val="nb-NO"/>
+        </w:rPr>
+        <w:t>integrerer</w:t>
+      </w:r>
+      <w:proofErr w:type="gramEnd"/>
+      <w:r>
+        <w:rPr>
+          <w:lang w:val="nb-NO"/>
+        </w:rPr>
+        <w:t xml:space="preserve"> klimaprojeksjoner til 2100 i tomtevurderingen.”</w:t>
       </w:r>
     </w:p>
     <w:p>
@@ -1490,7 +1602,21 @@
         <w:rPr>
           <w:lang w:val="nb-NO"/>
         </w:rPr>
-        <w:t xml:space="preserve">“Verktøyet er live på </w:t>
+        <w:t xml:space="preserve">“Verktøyet er </w:t>
+      </w:r>
+      <w:proofErr w:type="gramStart"/>
+      <w:r>
+        <w:rPr>
+          <w:lang w:val="nb-NO"/>
+        </w:rPr>
+        <w:t>live</w:t>
+      </w:r>
+      <w:proofErr w:type="gramEnd"/>
+      <w:r>
+        <w:rPr>
+          <w:lang w:val="nb-NO"/>
+        </w:rPr>
+        <w:t xml:space="preserve"> på </w:t>
       </w:r>
       <w:proofErr w:type="spellStart"/>
       <w:r>

</xml_diff>